<commit_message>
docs: update author to Lai Thi Thanh Xuan (23110309), deploy link onrender.com, and Google Drive links
</commit_message>
<xml_diff>
--- a/docs/Mau_04_Test_Plan.docx
+++ b/docs/Mau_04_Test_Plan.docx
@@ -159,7 +159,7 @@
           </w:tcPr>
           <w:p>
             <w:r>
-              <w:t>Sinh viên A – SV20260001</w:t>
+              <w:t>Lại Thị Thanh Xuân – 23110309</w:t>
             </w:r>
           </w:p>
         </w:tc>
@@ -219,7 +219,7 @@
           </w:tcPr>
           <w:p>
             <w:r>
-              <w:t>http://127.0.0.1:8001</w:t>
+              <w:t>https://itick-platform.onrender.com/ (Local: http://127.0.0.1:8001)</w:t>
             </w:r>
           </w:p>
         </w:tc>

</xml_diff>